<commit_message>
sample has been updated
</commit_message>
<xml_diff>
--- a/Evidence/69524-Localized-Form-Messages-Validation-Report.docx
+++ b/Evidence/69524-Localized-Form-Messages-Validation-Report.docx
@@ -405,7 +405,7 @@
                 <w:sz w:val="24"/>
                 <w:szCs w:val="24"/>
               </w:rPr>
-              <w:t>September 28, 2026</w:t>
+              <w:t>October 1, 2026</w:t>
             </w:r>
           </w:p>
         </w:tc>
@@ -465,7 +465,7 @@
                 <w:sz w:val="24"/>
                 <w:szCs w:val="24"/>
               </w:rPr>
-              <w:t>Passed with one issue identified</w:t>
+              <w:t>Pass</w:t>
             </w:r>
           </w:p>
         </w:tc>
@@ -791,9 +791,9 @@
         <w:tblLook w:val="04A0" w:firstRow="1" w:lastRow="0" w:firstColumn="1" w:lastColumn="0" w:noHBand="0" w:noVBand="1"/>
       </w:tblPr>
       <w:tblGrid>
-        <w:gridCol w:w="2937"/>
-        <w:gridCol w:w="2593"/>
-        <w:gridCol w:w="4540"/>
+        <w:gridCol w:w="3096"/>
+        <w:gridCol w:w="1800"/>
+        <w:gridCol w:w="4896"/>
       </w:tblGrid>
       <w:tr>
         <w:trPr>
@@ -1031,28 +1031,7 @@
                 <w:sz w:val="24"/>
                 <w:szCs w:val="24"/>
               </w:rPr>
-              <w:t>Fail,</w:t>
-            </w:r>
-            <w:r>
-              <w:rPr>
-                <w:rFonts w:ascii="Consolas" w:eastAsia="Times New Roman" w:hAnsi="Consolas" w:cs="Times New Roman"/>
-                <w:b/>
-                <w:bCs/>
-                <w:color w:val="569CD6"/>
-                <w:sz w:val="24"/>
-                <w:szCs w:val="24"/>
-                <w:lang w:bidi="ta-IN"/>
-              </w:rPr>
-              <w:t xml:space="preserve"> </w:t>
-            </w:r>
-            <w:r>
-              <w:rPr>
-                <w:b/>
-                <w:bCs/>
-                <w:sz w:val="24"/>
-                <w:szCs w:val="24"/>
-              </w:rPr>
-              <w:t>missing-resource-key fallback leaks raw key in Interactive WebAssembly/Server</w:t>
+              <w:t>pass</w:t>
             </w:r>
           </w:p>
           <w:p>
@@ -1232,16 +1211,7 @@
                 <w:sz w:val="24"/>
                 <w:szCs w:val="24"/>
               </w:rPr>
-              <w:t xml:space="preserve">Fail, </w:t>
-            </w:r>
-            <w:r>
-              <w:rPr>
-                <w:b/>
-                <w:bCs/>
-                <w:sz w:val="24"/>
-                <w:szCs w:val="24"/>
-              </w:rPr>
-              <w:t>missing-resource-key fallback leaks raw key in Interactive WebAssembly/Server</w:t>
+              <w:t>pass</w:t>
             </w:r>
           </w:p>
           <w:p>
@@ -1335,21 +1305,7 @@
                 <w:sz w:val="24"/>
                 <w:szCs w:val="24"/>
               </w:rPr>
-              <w:t>P</w:t>
-            </w:r>
-            <w:r>
-              <w:rPr>
-                <w:sz w:val="24"/>
-                <w:szCs w:val="24"/>
-              </w:rPr>
-              <w:t>ass</w:t>
-            </w:r>
-            <w:r>
-              <w:rPr>
-                <w:sz w:val="24"/>
-                <w:szCs w:val="24"/>
-              </w:rPr>
-              <w:t xml:space="preserve"> with known different display messages for certain fields</w:t>
+              <w:t>pass</w:t>
             </w:r>
           </w:p>
         </w:tc>
@@ -1800,7 +1756,6 @@
                 <w:sz w:val="24"/>
                 <w:szCs w:val="24"/>
               </w:rPr>
-              <w:lastRenderedPageBreak/>
               <w:t>Must Hold Condition</w:t>
             </w:r>
           </w:p>
@@ -2008,7 +1963,7 @@
                 <w:sz w:val="24"/>
                 <w:szCs w:val="24"/>
               </w:rPr>
-              <w:t>Fail</w:t>
+              <w:t>pass</w:t>
             </w:r>
           </w:p>
         </w:tc>
@@ -2067,7 +2022,7 @@
                 <w:sz w:val="24"/>
                 <w:szCs w:val="24"/>
               </w:rPr>
-              <w:t>Pass with known different display messages for certain fields</w:t>
+              <w:t>pass</w:t>
             </w:r>
           </w:p>
         </w:tc>
@@ -2099,6 +2054,7 @@
                 <w:sz w:val="24"/>
                 <w:szCs w:val="24"/>
               </w:rPr>
+              <w:lastRenderedPageBreak/>
               <w:t>The displayed UI culture matches the selected language</w:t>
             </w:r>
           </w:p>
@@ -2916,99 +2872,6 @@
           </w:p>
         </w:tc>
       </w:tr>
-      <w:tr>
-        <w:trPr>
-          <w:jc w:val="center"/>
-        </w:trPr>
-        <w:tc>
-          <w:tcPr>
-            <w:tcW w:w="1440" w:type="dxa"/>
-            <w:tcMar>
-              <w:top w:w="90" w:type="dxa"/>
-              <w:left w:w="110" w:type="dxa"/>
-              <w:bottom w:w="90" w:type="dxa"/>
-              <w:right w:w="110" w:type="dxa"/>
-            </w:tcMar>
-            <w:vAlign w:val="center"/>
-          </w:tcPr>
-          <w:p>
-            <w:pPr>
-              <w:rPr>
-                <w:sz w:val="24"/>
-                <w:szCs w:val="24"/>
-              </w:rPr>
-            </w:pPr>
-            <w:r>
-              <w:rPr>
-                <w:sz w:val="24"/>
-                <w:szCs w:val="24"/>
-              </w:rPr>
-              <w:t>TC-07</w:t>
-            </w:r>
-          </w:p>
-        </w:tc>
-        <w:tc>
-          <w:tcPr>
-            <w:tcW w:w="6336" w:type="dxa"/>
-            <w:tcMar>
-              <w:top w:w="90" w:type="dxa"/>
-              <w:left w:w="110" w:type="dxa"/>
-              <w:bottom w:w="90" w:type="dxa"/>
-              <w:right w:w="110" w:type="dxa"/>
-            </w:tcMar>
-            <w:vAlign w:val="center"/>
-          </w:tcPr>
-          <w:p>
-            <w:pPr>
-              <w:rPr>
-                <w:sz w:val="24"/>
-                <w:szCs w:val="24"/>
-              </w:rPr>
-            </w:pPr>
-            <w:r>
-              <w:rPr>
-                <w:sz w:val="24"/>
-                <w:szCs w:val="24"/>
-              </w:rPr>
-              <w:t>M</w:t>
-            </w:r>
-            <w:r>
-              <w:rPr>
-                <w:sz w:val="24"/>
-                <w:szCs w:val="24"/>
-              </w:rPr>
-              <w:t>issing-resource-key fallback leaks raw key in Interactive WebAssembly/Server</w:t>
-            </w:r>
-          </w:p>
-        </w:tc>
-        <w:tc>
-          <w:tcPr>
-            <w:tcW w:w="2016" w:type="dxa"/>
-            <w:tcMar>
-              <w:top w:w="90" w:type="dxa"/>
-              <w:left w:w="110" w:type="dxa"/>
-              <w:bottom w:w="90" w:type="dxa"/>
-              <w:right w:w="110" w:type="dxa"/>
-            </w:tcMar>
-            <w:vAlign w:val="center"/>
-          </w:tcPr>
-          <w:p>
-            <w:pPr>
-              <w:rPr>
-                <w:sz w:val="24"/>
-                <w:szCs w:val="24"/>
-              </w:rPr>
-            </w:pPr>
-            <w:r>
-              <w:rPr>
-                <w:sz w:val="24"/>
-                <w:szCs w:val="24"/>
-              </w:rPr>
-              <w:t>Attached</w:t>
-            </w:r>
-          </w:p>
-        </w:tc>
-      </w:tr>
     </w:tbl>
     <w:p>
       <w:pPr>
@@ -3023,41 +2886,16 @@
           <w:sz w:val="24"/>
           <w:szCs w:val="24"/>
         </w:rPr>
-        <w:lastRenderedPageBreak/>
         <w:t xml:space="preserve">Problems Found: </w:t>
       </w:r>
     </w:p>
     <w:p>
       <w:pPr>
-        <w:pStyle w:val="Heading2"/>
-        <w:rPr>
-          <w:color w:val="365F91" w:themeColor="accent1" w:themeShade="BF"/>
-          <w:sz w:val="24"/>
-          <w:szCs w:val="24"/>
-        </w:rPr>
-      </w:pPr>
-      <w:r>
         <w:rPr>
           <w:sz w:val="24"/>
           <w:szCs w:val="24"/>
         </w:rPr>
-        <w:t>Issue</w:t>
-      </w:r>
-      <w:r>
-        <w:rPr>
-          <w:sz w:val="24"/>
-          <w:szCs w:val="24"/>
-        </w:rPr>
-        <w:t xml:space="preserve">: </w:t>
-      </w:r>
-      <w:r>
-        <w:rPr>
-          <w:color w:val="365F91" w:themeColor="accent1" w:themeShade="BF"/>
-          <w:sz w:val="24"/>
-          <w:szCs w:val="24"/>
-        </w:rPr>
-        <w:t>Missing-resource-key fallback does not display the built-in Required validation message in Interactive Server and Interactive WebAssembly when the validation resource key cannot be resolved.</w:t>
-      </w:r>
+      </w:pPr>
     </w:p>
     <w:p>
       <w:pPr>
@@ -3078,556 +2916,7 @@
           <w:sz w:val="24"/>
           <w:szCs w:val="24"/>
         </w:rPr>
-        <w:t>During validation, unresolved validation resource keys did not consistently fall back to a readable built-in validation message as documented.</w:t>
-      </w:r>
-    </w:p>
-    <w:p>
-      <w:pPr>
-        <w:pStyle w:val="Heading2"/>
-      </w:pPr>
-      <w:r>
-        <w:t>Observed Behavior</w:t>
-      </w:r>
-    </w:p>
-    <w:p>
-      <w:pPr>
-        <w:pStyle w:val="Heading2"/>
-        <w:rPr>
-          <w:b w:val="0"/>
-          <w:bCs w:val="0"/>
-          <w:color w:val="auto"/>
-          <w:sz w:val="24"/>
-          <w:szCs w:val="24"/>
-        </w:rPr>
-      </w:pPr>
-      <w:r>
-        <w:rPr>
-          <w:b w:val="0"/>
-          <w:bCs w:val="0"/>
-          <w:color w:val="auto"/>
-          <w:sz w:val="24"/>
-          <w:szCs w:val="24"/>
-        </w:rPr>
-        <w:t>When the validation resource key cannot be resolved:</w:t>
-      </w:r>
-    </w:p>
-    <w:p>
-      <w:pPr>
-        <w:pStyle w:val="Heading2"/>
-        <w:numPr>
-          <w:ilvl w:val="0"/>
-          <w:numId w:val="22"/>
-        </w:numPr>
-        <w:rPr>
-          <w:b w:val="0"/>
-          <w:bCs w:val="0"/>
-          <w:color w:val="auto"/>
-          <w:sz w:val="24"/>
-          <w:szCs w:val="24"/>
-        </w:rPr>
-      </w:pPr>
-      <w:r>
-        <w:rPr>
-          <w:b w:val="0"/>
-          <w:bCs w:val="0"/>
-          <w:color w:val="auto"/>
-          <w:sz w:val="24"/>
-          <w:szCs w:val="24"/>
-        </w:rPr>
-        <w:t>Interactive Server displays the unresolved resource key instead of a readable fallback validation message.</w:t>
-      </w:r>
-    </w:p>
-    <w:p>
-      <w:pPr>
-        <w:pStyle w:val="Heading2"/>
-        <w:numPr>
-          <w:ilvl w:val="0"/>
-          <w:numId w:val="22"/>
-        </w:numPr>
-        <w:rPr>
-          <w:b w:val="0"/>
-          <w:bCs w:val="0"/>
-          <w:color w:val="auto"/>
-          <w:sz w:val="24"/>
-          <w:szCs w:val="24"/>
-        </w:rPr>
-      </w:pPr>
-      <w:r>
-        <w:rPr>
-          <w:b w:val="0"/>
-          <w:bCs w:val="0"/>
-          <w:color w:val="auto"/>
-          <w:sz w:val="24"/>
-          <w:szCs w:val="24"/>
-        </w:rPr>
-        <w:t>Interactive WebAssembly displays the unresolved resource key instead of a readable fallback validation message.</w:t>
-      </w:r>
-    </w:p>
-    <w:p>
-      <w:pPr>
-        <w:pStyle w:val="Heading2"/>
-      </w:pPr>
-      <w:r>
-        <w:t>Expected Behavior</w:t>
-      </w:r>
-    </w:p>
-    <w:p>
-      <w:pPr>
-        <w:pStyle w:val="Heading2"/>
-        <w:numPr>
-          <w:ilvl w:val="0"/>
-          <w:numId w:val="24"/>
-        </w:numPr>
-        <w:rPr>
-          <w:b w:val="0"/>
-          <w:bCs w:val="0"/>
-          <w:color w:val="auto"/>
-          <w:sz w:val="24"/>
-          <w:szCs w:val="24"/>
-        </w:rPr>
-      </w:pPr>
-      <w:r>
-        <w:rPr>
-          <w:b w:val="0"/>
-          <w:bCs w:val="0"/>
-          <w:color w:val="auto"/>
-          <w:sz w:val="24"/>
-          <w:szCs w:val="24"/>
-        </w:rPr>
-        <w:t>When a validation resource key cannot be resolved through the localization fallback chain, the framework should fall back to the attribute's built-in Required message rather than showing the raw key.</w:t>
-      </w:r>
-    </w:p>
-    <w:p>
-      <w:pPr>
-        <w:pStyle w:val="Heading2"/>
-      </w:pPr>
-      <w:r>
-        <w:t>Actual Behavior</w:t>
-      </w:r>
-    </w:p>
-    <w:p>
-      <w:pPr>
-        <w:pStyle w:val="Heading2"/>
-        <w:numPr>
-          <w:ilvl w:val="0"/>
-          <w:numId w:val="23"/>
-        </w:numPr>
-        <w:rPr>
-          <w:b w:val="0"/>
-          <w:bCs w:val="0"/>
-          <w:color w:val="auto"/>
-          <w:sz w:val="24"/>
-          <w:szCs w:val="24"/>
-        </w:rPr>
-      </w:pPr>
-      <w:r>
-        <w:rPr>
-          <w:b w:val="0"/>
-          <w:bCs w:val="0"/>
-          <w:color w:val="auto"/>
-          <w:sz w:val="24"/>
-          <w:szCs w:val="24"/>
-        </w:rPr>
-        <w:t>The unresolved resource key is displayed as the validation message instead of the attribute's built-in fallback message.</w:t>
-      </w:r>
-    </w:p>
-    <w:p>
-      <w:pPr>
-        <w:pStyle w:val="ListParagraph"/>
-        <w:rPr>
-          <w:b/>
-          <w:bCs/>
-          <w:sz w:val="24"/>
-          <w:szCs w:val="24"/>
-        </w:rPr>
-      </w:pPr>
-    </w:p>
-    <w:p>
-      <w:pPr>
-        <w:pStyle w:val="ListParagraph"/>
-        <w:rPr>
-          <w:b/>
-          <w:bCs/>
-          <w:sz w:val="24"/>
-          <w:szCs w:val="24"/>
-        </w:rPr>
-      </w:pPr>
-    </w:p>
-    <w:p>
-      <w:pPr>
-        <w:pStyle w:val="ListParagraph"/>
-        <w:numPr>
-          <w:ilvl w:val="0"/>
-          <w:numId w:val="25"/>
-        </w:numPr>
-        <w:rPr>
-          <w:b/>
-          <w:bCs/>
-          <w:sz w:val="24"/>
-          <w:szCs w:val="24"/>
-        </w:rPr>
-      </w:pPr>
-      <w:r>
-        <w:rPr>
-          <w:b/>
-          <w:bCs/>
-          <w:sz w:val="24"/>
-          <w:szCs w:val="24"/>
-        </w:rPr>
-        <w:t>Explicit Key Scenario</w:t>
-      </w:r>
-    </w:p>
-    <w:p>
-      <w:pPr>
-        <w:pStyle w:val="Heading2"/>
-        <w:rPr>
-          <w:sz w:val="24"/>
-          <w:szCs w:val="24"/>
-        </w:rPr>
-      </w:pPr>
-      <w:r>
-        <w:rPr>
-          <w:sz w:val="24"/>
-          <w:szCs w:val="24"/>
-        </w:rPr>
-        <w:t>Steps to Reproduce</w:t>
-      </w:r>
-    </w:p>
-    <w:p>
-      <w:pPr>
-        <w:pStyle w:val="ListParagraph"/>
-        <w:numPr>
-          <w:ilvl w:val="0"/>
-          <w:numId w:val="17"/>
-        </w:numPr>
-        <w:rPr>
-          <w:sz w:val="24"/>
-          <w:szCs w:val="24"/>
-        </w:rPr>
-      </w:pPr>
-      <w:r>
-        <w:rPr>
-          <w:sz w:val="24"/>
-          <w:szCs w:val="24"/>
-        </w:rPr>
-        <w:t>Launch the application.</w:t>
-      </w:r>
-    </w:p>
-    <w:p>
-      <w:pPr>
-        <w:pStyle w:val="ListParagraph"/>
-        <w:numPr>
-          <w:ilvl w:val="0"/>
-          <w:numId w:val="17"/>
-        </w:numPr>
-        <w:rPr>
-          <w:sz w:val="24"/>
-          <w:szCs w:val="24"/>
-        </w:rPr>
-      </w:pPr>
-      <w:r>
-        <w:rPr>
-          <w:sz w:val="24"/>
-          <w:szCs w:val="24"/>
-        </w:rPr>
-        <w:t>Navigate to /client-validation or /server-validation.</w:t>
-      </w:r>
-    </w:p>
-    <w:p>
-      <w:pPr>
-        <w:pStyle w:val="ListParagraph"/>
-        <w:numPr>
-          <w:ilvl w:val="0"/>
-          <w:numId w:val="17"/>
-        </w:numPr>
-        <w:rPr>
-          <w:sz w:val="24"/>
-          <w:szCs w:val="24"/>
-        </w:rPr>
-      </w:pPr>
-      <w:r>
-        <w:rPr>
-          <w:sz w:val="24"/>
-          <w:szCs w:val="24"/>
-        </w:rPr>
-        <w:t>Leave the Missing Resource field empty.</w:t>
-      </w:r>
-    </w:p>
-    <w:p>
-      <w:pPr>
-        <w:pStyle w:val="ListParagraph"/>
-        <w:numPr>
-          <w:ilvl w:val="0"/>
-          <w:numId w:val="17"/>
-        </w:numPr>
-        <w:rPr>
-          <w:sz w:val="24"/>
-          <w:szCs w:val="24"/>
-        </w:rPr>
-      </w:pPr>
-      <w:r>
-        <w:rPr>
-          <w:sz w:val="24"/>
-          <w:szCs w:val="24"/>
-        </w:rPr>
-        <w:t>Submit the form.</w:t>
-      </w:r>
-    </w:p>
-    <w:p>
-      <w:pPr>
-        <w:rPr>
-          <w:b/>
-          <w:bCs/>
-          <w:sz w:val="24"/>
-          <w:szCs w:val="24"/>
-        </w:rPr>
-      </w:pPr>
-      <w:r>
-        <w:rPr>
-          <w:b/>
-          <w:bCs/>
-          <w:sz w:val="24"/>
-          <w:szCs w:val="24"/>
-        </w:rPr>
-        <w:t>Expected Result</w:t>
-      </w:r>
-    </w:p>
-    <w:p>
-      <w:pPr>
-        <w:rPr>
-          <w:sz w:val="24"/>
-          <w:szCs w:val="24"/>
-        </w:rPr>
-      </w:pPr>
-      <w:r>
-        <w:rPr>
-          <w:sz w:val="24"/>
-          <w:szCs w:val="24"/>
-        </w:rPr>
-        <w:t>A readable built-in validation message is displayed.</w:t>
-      </w:r>
-    </w:p>
-    <w:p>
-      <w:pPr>
-        <w:rPr>
-          <w:b/>
-          <w:bCs/>
-          <w:sz w:val="24"/>
-          <w:szCs w:val="24"/>
-        </w:rPr>
-      </w:pPr>
-      <w:r>
-        <w:rPr>
-          <w:b/>
-          <w:bCs/>
-          <w:sz w:val="24"/>
-          <w:szCs w:val="24"/>
-        </w:rPr>
-        <w:t>Actual Result</w:t>
-      </w:r>
-    </w:p>
-    <w:p>
-      <w:pPr>
-        <w:rPr>
-          <w:sz w:val="24"/>
-          <w:szCs w:val="24"/>
-        </w:rPr>
-      </w:pPr>
-      <w:r>
-        <w:rPr>
-          <w:sz w:val="24"/>
-          <w:szCs w:val="24"/>
-        </w:rPr>
-        <w:t>The raw key ResourceKeyThatDoesNotExist is displayed.</w:t>
-      </w:r>
-    </w:p>
-    <w:p>
-      <w:pPr>
-        <w:pStyle w:val="ListParagraph"/>
-        <w:numPr>
-          <w:ilvl w:val="0"/>
-          <w:numId w:val="25"/>
-        </w:numPr>
-        <w:rPr>
-          <w:b/>
-          <w:bCs/>
-          <w:sz w:val="24"/>
-          <w:szCs w:val="24"/>
-        </w:rPr>
-      </w:pPr>
-      <w:r>
-        <w:rPr>
-          <w:b/>
-          <w:bCs/>
-          <w:sz w:val="24"/>
-          <w:szCs w:val="24"/>
-        </w:rPr>
-        <w:lastRenderedPageBreak/>
-        <w:t>Convention-Based Key Scenario</w:t>
-      </w:r>
-    </w:p>
-    <w:p>
-      <w:pPr>
-        <w:pStyle w:val="Heading2"/>
-        <w:rPr>
-          <w:sz w:val="24"/>
-          <w:szCs w:val="24"/>
-        </w:rPr>
-      </w:pPr>
-      <w:r>
-        <w:rPr>
-          <w:sz w:val="24"/>
-          <w:szCs w:val="24"/>
-        </w:rPr>
-        <w:t>Steps to Reproduce</w:t>
-      </w:r>
-    </w:p>
-    <w:p>
-      <w:pPr>
-        <w:pStyle w:val="ListParagraph"/>
-        <w:numPr>
-          <w:ilvl w:val="0"/>
-          <w:numId w:val="18"/>
-        </w:numPr>
-        <w:rPr>
-          <w:sz w:val="24"/>
-          <w:szCs w:val="24"/>
-        </w:rPr>
-      </w:pPr>
-      <w:r>
-        <w:rPr>
-          <w:sz w:val="24"/>
-          <w:szCs w:val="24"/>
-        </w:rPr>
-        <w:t>Remove ServerValidationModel_ConventionalName_RequiredAttribute_Error from ServerValidationMessages.de-DE.resx.</w:t>
-      </w:r>
-    </w:p>
-    <w:p>
-      <w:pPr>
-        <w:pStyle w:val="ListParagraph"/>
-        <w:numPr>
-          <w:ilvl w:val="0"/>
-          <w:numId w:val="18"/>
-        </w:numPr>
-        <w:rPr>
-          <w:sz w:val="24"/>
-          <w:szCs w:val="24"/>
-        </w:rPr>
-      </w:pPr>
-      <w:r>
-        <w:rPr>
-          <w:sz w:val="24"/>
-          <w:szCs w:val="24"/>
-        </w:rPr>
-        <w:t>Ensure the neutral resource file does not contain the key.</w:t>
-      </w:r>
-    </w:p>
-    <w:p>
-      <w:pPr>
-        <w:pStyle w:val="ListParagraph"/>
-        <w:numPr>
-          <w:ilvl w:val="0"/>
-          <w:numId w:val="18"/>
-        </w:numPr>
-        <w:rPr>
-          <w:sz w:val="24"/>
-          <w:szCs w:val="24"/>
-        </w:rPr>
-      </w:pPr>
-      <w:r>
-        <w:rPr>
-          <w:sz w:val="24"/>
-          <w:szCs w:val="24"/>
-        </w:rPr>
-        <w:t>Run the application with de-DE culture.</w:t>
-      </w:r>
-    </w:p>
-    <w:p>
-      <w:pPr>
-        <w:pStyle w:val="ListParagraph"/>
-        <w:numPr>
-          <w:ilvl w:val="0"/>
-          <w:numId w:val="18"/>
-        </w:numPr>
-        <w:rPr>
-          <w:sz w:val="24"/>
-          <w:szCs w:val="24"/>
-        </w:rPr>
-      </w:pPr>
-      <w:r>
-        <w:rPr>
-          <w:sz w:val="24"/>
-          <w:szCs w:val="24"/>
-        </w:rPr>
-        <w:t>Leave Conventional Name empty and submit.</w:t>
-      </w:r>
-    </w:p>
-    <w:p>
-      <w:pPr>
-        <w:rPr>
-          <w:b/>
-          <w:bCs/>
-          <w:sz w:val="24"/>
-          <w:szCs w:val="24"/>
-        </w:rPr>
-      </w:pPr>
-      <w:r>
-        <w:rPr>
-          <w:b/>
-          <w:bCs/>
-          <w:sz w:val="24"/>
-          <w:szCs w:val="24"/>
-        </w:rPr>
-        <w:t>Expected Result</w:t>
-      </w:r>
-    </w:p>
-    <w:p>
-      <w:pPr>
-        <w:rPr>
-          <w:sz w:val="24"/>
-          <w:szCs w:val="24"/>
-        </w:rPr>
-      </w:pPr>
-      <w:r>
-        <w:rPr>
-          <w:sz w:val="24"/>
-          <w:szCs w:val="24"/>
-        </w:rPr>
-        <w:t>Built-in Required message is shown.</w:t>
-      </w:r>
-    </w:p>
-    <w:p>
-      <w:pPr>
-        <w:rPr>
-          <w:b/>
-          <w:bCs/>
-          <w:sz w:val="24"/>
-          <w:szCs w:val="24"/>
-        </w:rPr>
-      </w:pPr>
-      <w:r>
-        <w:rPr>
-          <w:b/>
-          <w:bCs/>
-          <w:sz w:val="24"/>
-          <w:szCs w:val="24"/>
-        </w:rPr>
-        <w:t>Actual Result</w:t>
-      </w:r>
-    </w:p>
-    <w:p>
-      <w:pPr>
-        <w:rPr>
-          <w:sz w:val="24"/>
-          <w:szCs w:val="24"/>
-        </w:rPr>
-      </w:pPr>
-      <w:r>
-        <w:rPr>
-          <w:sz w:val="24"/>
-          <w:szCs w:val="24"/>
-        </w:rPr>
-        <w:t>Raw key or ResourceNotFound value is displayed.</w:t>
+        <w:t>No issues were found while testing.</w:t>
       </w:r>
     </w:p>
     <w:p>
@@ -3699,7 +2988,7 @@
           <w:sz w:val="24"/>
           <w:szCs w:val="24"/>
         </w:rPr>
-        <w:t xml:space="preserve">Passed </w:t>
+        <w:t>Passed</w:t>
       </w:r>
       <w:r>
         <w:rPr>
@@ -3707,7 +2996,7 @@
           <w:sz w:val="24"/>
           <w:szCs w:val="24"/>
         </w:rPr>
-        <w:t>with one issue identified.</w:t>
+        <w:t>.</w:t>
       </w:r>
     </w:p>
     <w:p>
@@ -3724,13 +3013,12 @@
           <w:sz w:val="24"/>
           <w:szCs w:val="24"/>
         </w:rPr>
-        <w:t>All documented localization scenarios were validated successfully across Static SSR, Interactive Server, and Interactive WebAssembly render modes. Expected localized messages were displayed correctly for supported cultures, nested object validation, collection validation, and validation state transitions.</w:t>
+        <w:t>Overall Result: Pass.</w:t>
       </w:r>
     </w:p>
     <w:p>
       <w:pPr>
         <w:rPr>
-          <w:bCs/>
           <w:sz w:val="24"/>
           <w:szCs w:val="24"/>
         </w:rPr>
@@ -3741,50 +3029,8 @@
           <w:sz w:val="24"/>
           <w:szCs w:val="24"/>
         </w:rPr>
-        <w:t xml:space="preserve">A single issue was identified involving </w:t>
+        <w:t>All mandatory validation conditions for dotnet/aspnetcore#69524 were executed and verified in the required Static SSR and Interactive WebAssembly configurations. Both modes use the same shared [ValidatableType] ContactModel for the Name and Email scenario. In fr-FR, both modes display the same localized conventional Name message and explicit Email message. In de-DE, both modes display the same readable built-in fallback Name message while preserving the translated explicit Email message. Correcting Name and Email clears their validation messages in both required modes. The visible UI culture indicator matched the selected culture during each validation run.</w:t>
       </w:r>
-      <w:r>
-        <w:rPr>
-          <w:b/>
-          <w:bCs/>
-          <w:sz w:val="24"/>
-          <w:szCs w:val="24"/>
-        </w:rPr>
-        <w:t>missing-resource-key fallback behavior</w:t>
-      </w:r>
-      <w:r>
-        <w:rPr>
-          <w:bCs/>
-          <w:sz w:val="24"/>
-          <w:szCs w:val="24"/>
-        </w:rPr>
-        <w:t>. When a localization resource key cannot be resolved, all render modes display unresolved resource keys instead of falling back to a readable built-in validation message as documented. The issue affects both explicit and convention-based validation keys.</w:t>
-      </w:r>
-    </w:p>
-    <w:p>
-      <w:pPr>
-        <w:rPr>
-          <w:bCs/>
-          <w:sz w:val="24"/>
-          <w:szCs w:val="24"/>
-        </w:rPr>
-      </w:pPr>
-      <w:r>
-        <w:rPr>
-          <w:bCs/>
-          <w:sz w:val="24"/>
-          <w:szCs w:val="24"/>
-        </w:rPr>
-        <w:t>Apart from this identified issue, localized validation messages, formatted messages, nested object validation, collection validation, culture-specific resources, and validation state transitions behaved as expected across the tested render modes.</w:t>
-      </w:r>
-    </w:p>
-    <w:p>
-      <w:pPr>
-        <w:rPr>
-          <w:sz w:val="24"/>
-          <w:szCs w:val="24"/>
-        </w:rPr>
-      </w:pPr>
     </w:p>
     <w:sectPr>
       <w:footerReference w:type="default" r:id="rId15"/>
@@ -6898,6 +6144,7 @@
   <w:style w:type="character" w:default="1" w:styleId="DefaultParagraphFont">
     <w:name w:val="Default Paragraph Font"/>
     <w:uiPriority w:val="1"/>
+    <w:semiHidden/>
     <w:unhideWhenUsed/>
   </w:style>
   <w:style w:type="table" w:default="1" w:styleId="TableNormal">

</xml_diff>